<commit_message>
Chạy song song nhiều ảnh cùng lúc
Mặc định 3 luồng, chỉnh bằng -t, tối đa 10. Đo thực tế: 6 ảnh với 3
luồng mất 84 giây thay vì ~210 giây chạy tuần tự.

- Báo cáo và tên file giữ đúng thứ tự dòng trong Excel dù job về
  không theo thứ tự
- Khoá riêng cho từng file khi upload ảnh tham chiếu: nhiều luồng
  cùng cần một ảnh thì chỉ một luồng upload, số còn lại dùng chung
  kết quả thay vì mỗi luồng upload một lần
- Mọi thao tác in ra màn hình đi qua khoá chung để các dòng không
  đè lên nhau

Co-Authored-By: Claude Opus 5 (1M context) <noreply@anthropic.com>
</commit_message>
<xml_diff>
--- a/HUONG-DAN.docx
+++ b/HUONG-DAN.docx
@@ -766,6 +766,29 @@
     </w:p>
     <w:p>
       <w:r>
+        <w:t>Tạo nhiều ảnh cùng lúc cho nhanh:</w:t>
+      </w:r>
+    </w:p>
+    <w:p>
+      <w:pPr>
+        <w:spacing w:after="0"/>
+        <w:ind w:left="480"/>
+      </w:pPr>
+      <w:r>
+        <w:rPr>
+          <w:rFonts w:ascii="Consolas" w:hAnsi="Consolas"/>
+          <w:sz w:val="20"/>
+        </w:rPr>
+        <w:t>TaoAnh.exe jobs.xlsx -t 6</w:t>
+      </w:r>
+    </w:p>
+    <w:p>
+      <w:pPr>
+        <w:spacing w:after="0"/>
+      </w:pPr>
+    </w:p>
+    <w:p>
+      <w:r>
         <w:t>Chỉ kiểm tra, không tạo ảnh:</w:t>
       </w:r>
     </w:p>
@@ -832,6 +855,21 @@
       <w:pPr>
         <w:spacing w:after="0"/>
       </w:pPr>
+    </w:p>
+    <w:p>
+      <w:pPr>
+        <w:ind w:left="240"/>
+      </w:pPr>
+      <w:r>
+        <w:rPr>
+          <w:b/>
+          <w:color w:val="1F6FB2"/>
+        </w:rPr>
+        <w:t xml:space="preserve">LƯU Ý: </w:t>
+      </w:r>
+      <w:r>
+        <w:t>Mặc định chương trình tạo 3 ảnh cùng lúc. Muốn nhanh hơn thì tăng lên bằng -t, tối đa 10. Đặt cao quá không nhanh thêm mà chỉ nặng máy chủ.</w:t>
+      </w:r>
     </w:p>
     <w:p>
       <w:pPr>

</xml_diff>

<commit_message>
Bộ file gửi thẳng cho người dùng, chỉnh số luồng trong config.txt
- Thêm 2 file .bat bấm đúp là chạy, và file DOC FILE NAY TRUOC.txt
  hướng dẫn 4 bước
- Số ảnh chạy cùng lúc đặt được trong config.txt, không cần dòng
  lệnh. Trần hạ từ 10 xuống 5.
- Lưu API key không còn ghi đè cả file, giữ nguyên cài đặt người
  dùng đã sửa
- Bỏ đường dẫn ảnh giả trong file mẫu: chạy lần đầu báo "không tìm
  thấy ảnh" làm người mới tưởng mình làm sai
- File .bat gọi exe bằng đường dẫn tuyệt đối, không phụ thuộc thư
  mục hiện tại
- Chỉ dẫn liên hệ nhận quota dùng thử ở chỗ hỏi API key
- Bỏ mục ghi chú API khỏi README

81 test.

Co-Authored-By: Claude Opus 5 (1M context) <noreply@anthropic.com>
</commit_message>
<xml_diff>
--- a/HUONG-DAN.docx
+++ b/HUONG-DAN.docx
@@ -46,6 +46,10 @@
       </w:pPr>
       <w:r>
         <w:t>Lấy API key: vào sangtao.ai → đăng nhập → Cài đặt → API Key → tạo key mới. Copy chuỗi key đó.</w:t>
+        <w:br/>
+        <w:t>Chưa có tài khoản, hoặc muốn dùng thử trước? Nhắn cho mình để được cấp 1000 ảnh miễn phí:</w:t>
+        <w:br/>
+        <w:t xml:space="preserve">    https://www.facebook.com/cong.dac.dev</w:t>
       </w:r>
     </w:p>
     <w:p>
@@ -541,6 +545,8 @@
       </w:pPr>
       <w:r>
         <w:t>Key sai hoặc đã bị xoá. Mở config.txt, dán lại key mới.</w:t>
+        <w:br/>
+        <w:t>Cần key mới thì nhắn: https://www.facebook.com/cong.dac.dev</w:t>
       </w:r>
     </w:p>
     <w:p>
@@ -643,6 +649,62 @@
       </w:r>
       <w:r>
         <w:t>Job bị lỗi KHÔNG bị trừ tiền, credit được hoàn tự động.</w:t>
+      </w:r>
+    </w:p>
+    <w:p>
+      <w:pPr>
+        <w:pStyle w:val="Heading1"/>
+      </w:pPr>
+      <w:r>
+        <w:t>CHẠY NHANH HƠN</w:t>
+      </w:r>
+    </w:p>
+    <w:p>
+      <w:r>
+        <w:t>Mặc định chương trình tạo 3 ảnh cùng lúc.</w:t>
+      </w:r>
+    </w:p>
+    <w:p>
+      <w:r>
+        <w:t>Muốn nhanh hơn thì mở file config.txt, sửa dòng:</w:t>
+      </w:r>
+    </w:p>
+    <w:p>
+      <w:pPr>
+        <w:spacing w:after="0"/>
+        <w:ind w:left="480"/>
+      </w:pPr>
+      <w:r>
+        <w:rPr>
+          <w:rFonts w:ascii="Consolas" w:hAnsi="Consolas"/>
+          <w:sz w:val="20"/>
+        </w:rPr>
+        <w:t>so_luong_cung_luc = 3</w:t>
+      </w:r>
+    </w:p>
+    <w:p>
+      <w:pPr>
+        <w:spacing w:after="0"/>
+      </w:pPr>
+    </w:p>
+    <w:p>
+      <w:r>
+        <w:t>Đổi số 3 thành số bạn muốn. Nhận từ 1 đến 5.</w:t>
+      </w:r>
+    </w:p>
+    <w:p>
+      <w:pPr>
+        <w:ind w:left="240"/>
+      </w:pPr>
+      <w:r>
+        <w:rPr>
+          <w:b/>
+          <w:color w:val="1F6FB2"/>
+        </w:rPr>
+        <w:t xml:space="preserve">LƯU Ý: </w:t>
+      </w:r>
+      <w:r>
+        <w:t>Đặt 5 là nhanh nhất. Ghi số lớn hơn cũng không nhanh thêm, chương trình sẽ tự hạ về 5.</w:t>
       </w:r>
     </w:p>
     <w:p>
@@ -779,7 +841,7 @@
           <w:rFonts w:ascii="Consolas" w:hAnsi="Consolas"/>
           <w:sz w:val="20"/>
         </w:rPr>
-        <w:t>TaoAnh.exe jobs.xlsx -t 6</w:t>
+        <w:t>TaoAnh.exe jobs.xlsx -t 5</w:t>
       </w:r>
     </w:p>
     <w:p>
@@ -855,21 +917,6 @@
       <w:pPr>
         <w:spacing w:after="0"/>
       </w:pPr>
-    </w:p>
-    <w:p>
-      <w:pPr>
-        <w:ind w:left="240"/>
-      </w:pPr>
-      <w:r>
-        <w:rPr>
-          <w:b/>
-          <w:color w:val="1F6FB2"/>
-        </w:rPr>
-        <w:t xml:space="preserve">LƯU Ý: </w:t>
-      </w:r>
-      <w:r>
-        <w:t>Mặc định chương trình tạo 3 ảnh cùng lúc. Muốn nhanh hơn thì tăng lên bằng -t, tối đa 10. Đặt cao quá không nhanh thêm mà chỉ nặng máy chủ.</w:t>
-      </w:r>
     </w:p>
     <w:p>
       <w:pPr>

</xml_diff>

<commit_message>
Lấy API key thì liên hệ trực tiếp, không bảo người dùng tự đăng ký
Tài khoản tự đăng ký không có quota nên không test được. Mọi chỗ
nói "vào sangtao.ai → đăng nhập → Cài đặt" đổi thành liên hệ để
được cấp key kèm 1000 ảnh miễn phí.

Sửa ở 6 chỗ: hướng dẫn (txt/docx), file DOC FILE NAY TRUOC,
màn hình hỏi key, thông báo key sai, mẫu config.txt, README.

Co-Authored-By: Claude Opus 5 (1M context) <noreply@anthropic.com>
</commit_message>
<xml_diff>
--- a/HUONG-DAN.docx
+++ b/HUONG-DAN.docx
@@ -45,9 +45,7 @@
         <w:pStyle w:val="ListNumber"/>
       </w:pPr>
       <w:r>
-        <w:t>Lấy API key: vào sangtao.ai → đăng nhập → Cài đặt → API Key → tạo key mới. Copy chuỗi key đó.</w:t>
-        <w:br/>
-        <w:t>Chưa có tài khoản, hoặc muốn dùng thử trước? Nhắn cho mình để được cấp 1000 ảnh miễn phí:</w:t>
+        <w:t>Lấy API key: nhắn cho mình để được cấp key kèm 1000 ảnh miễn phí.</w:t>
         <w:br/>
         <w:t xml:space="preserve">    https://www.facebook.com/cong.dac.dev</w:t>
       </w:r>
@@ -769,8 +767,26 @@
     </w:p>
     <w:p>
       <w:r>
-        <w:t>Nếu lỡ lộ key: vào sangtao.ai → Cài đặt → API Key → xoá key cũ và tạo key mới.</w:t>
+        <w:t>Nếu lỡ lộ key: nhắn cho mình để huỷ key cũ và cấp key mới:</w:t>
       </w:r>
+    </w:p>
+    <w:p>
+      <w:pPr>
+        <w:spacing w:after="0"/>
+        <w:ind w:left="480"/>
+      </w:pPr>
+      <w:r>
+        <w:rPr>
+          <w:rFonts w:ascii="Consolas" w:hAnsi="Consolas"/>
+          <w:sz w:val="20"/>
+        </w:rPr>
+        <w:t>https://www.facebook.com/cong.dac.dev</w:t>
+      </w:r>
+    </w:p>
+    <w:p>
+      <w:pPr>
+        <w:spacing w:after="0"/>
+      </w:pPr>
     </w:p>
     <w:p>
       <w:pPr>

</xml_diff>